<commit_message>
Add private user accounts, notes API and PostgreSQL deployment support
</commit_message>
<xml_diff>
--- a/sample_docs/broadband_bill.docx
+++ b/sample_docs/broadband_bill.docx
@@ -22,12 +22,12 @@
     </w:p>
     <w:p>
       <w:r>
-        <w:t>Bill Date: 10-10-2026</w:t>
+        <w:t>Bill Date: 20-10-2026</w:t>
       </w:r>
     </w:p>
     <w:p>
       <w:r>
-        <w:t>Due Date: 30-10-2026</w:t>
+        <w:t>Due Date: 09-11-2026</w:t>
       </w:r>
     </w:p>
     <w:p>

</xml_diff>